<commit_message>
Record 3.60.4 production deployment verification
</commit_message>
<xml_diff>
--- a/jackyun-portal/docs/sync-local-first-cue-conflicts-3.60.4.docx
+++ b/jackyun-portal/docs/sync-local-first-cue-conflicts-3.60.4.docx
@@ -921,7 +921,7 @@
     </w:p>
     <w:p>
       <w:r>
-        <w:t>以上均为本地构建与模拟验证。当前记录不代表已经完成 Main 合并、生产发布、真实账号云端读回或跨设备验收；这些状态将在实际操作后补录。</w:t>
+        <w:t>本地测试、lint 与生产构建已完成；代码也已合并到 Main 并发布到生产。真实账号云端数据读回和跨设备验收尚未执行。</w:t>
       </w:r>
     </w:p>
     <w:p>
@@ -934,7 +934,7 @@
     </w:p>
     <w:p>
       <w:r>
-        <w:t>代码准备在 codex/sync-cache-conflicts-3.60.4 隔离分支上。按照仓库要求，提交并合并到 Main 后，将检查 Vercel 生产部署是否为 READY，并核对部署对应的 Git 提交。如果部署失败或尚未触发，将如实记录构建/发布状态；生产部署成功也不等于用户个人数据已完成恢复。</w:t>
+        <w:t>代码已通过 PR #174 合并到 Main，合并提交为 f5e6c9d33ca6ff9ccef77e7db56f518be9740959。Vercel 生产部署 dpl_DbzhCT1co3yEFmhPwmcYhvfqkC7Y 状态为 READY，部署源码 SHA 与该合并提交一致；jackyun.top 已列为此部署的正式 alias。生产部署已验证，但这不证明用户个人数据已完成恢复。</w:t>
       </w:r>
     </w:p>
     <w:p>

</xml_diff>

<commit_message>
Record 3.60.4 production deployment verification (#175)
Update the task report with Main merge and Vercel production verification.
</commit_message>
<xml_diff>
--- a/jackyun-portal/docs/sync-local-first-cue-conflicts-3.60.4.docx
+++ b/jackyun-portal/docs/sync-local-first-cue-conflicts-3.60.4.docx
@@ -921,7 +921,7 @@
     </w:p>
     <w:p>
       <w:r>
-        <w:t>以上均为本地构建与模拟验证。当前记录不代表已经完成 Main 合并、生产发布、真实账号云端读回或跨设备验收；这些状态将在实际操作后补录。</w:t>
+        <w:t>本地测试、lint 与生产构建已完成；代码也已合并到 Main 并发布到生产。真实账号云端数据读回和跨设备验收尚未执行。</w:t>
       </w:r>
     </w:p>
     <w:p>
@@ -934,7 +934,7 @@
     </w:p>
     <w:p>
       <w:r>
-        <w:t>代码准备在 codex/sync-cache-conflicts-3.60.4 隔离分支上。按照仓库要求，提交并合并到 Main 后，将检查 Vercel 生产部署是否为 READY，并核对部署对应的 Git 提交。如果部署失败或尚未触发，将如实记录构建/发布状态；生产部署成功也不等于用户个人数据已完成恢复。</w:t>
+        <w:t>代码已通过 PR #174 合并到 Main，合并提交为 f5e6c9d33ca6ff9ccef77e7db56f518be9740959。Vercel 生产部署 dpl_DbzhCT1co3yEFmhPwmcYhvfqkC7Y 状态为 READY，部署源码 SHA 与该合并提交一致；jackyun.top 已列为此部署的正式 alias。生产部署已验证，但这不证明用户个人数据已完成恢复。</w:t>
       </w:r>
     </w:p>
     <w:p>

</xml_diff>